<commit_message>
Add submitted abstracts, update GSED status, and PGY-5 to CV
- New "Submitted Abstracts (Decision Pending)" section: ACS PA Commonwealth
  Chapter 2026 (Sub-I evaluation), AHPBA 2027 and SSO 2027 video abstracts
- Sub-I evaluation manuscript: under review at Global Surgical Education
  (revision submitted October 2026), R1 title and full byline
- PGY-4 -> PGY-5 in summary, current position, and site tagline
- Recent Updates entries for October 2026; regenerated PDF/DOCX downloads

Co-Authored-By: Claude Opus 5.5 <noreply@anthropic.com>
Claude-Session: https://claude.ai/code/session_018KAMAJPU5kaqqT22ajxcAi
</commit_message>
<xml_diff>
--- a/cv-downloads/aom-cv.docx
+++ b/cv-downloads/aom-cv.docx
@@ -176,7 +176,7 @@
         <w:pStyle w:val="FirstParagraph"/>
       </w:pPr>
       <w:r>
-        <w:t xml:space="preserve">General Surgery Resident (PGY-4) at Geisinger Northeast with research experience in transplant surgery at Cedars-Sinai Medical Center. UCSB alumnus from Los Angeles with background in clinical outcomes research, systematic reviews, and genomic medicine. Filipino-American physician interested in advancing surgical care through research and evidence-based practice.</w:t>
+        <w:t xml:space="preserve">General Surgery Resident (PGY-5) at Geisinger Northeast with research experience in transplant surgery at Cedars-Sinai Medical Center. UCSB alumnus from Los Angeles with background in clinical outcomes research, systematic reviews, and genomic medicine. Filipino-American physician interested in advancing surgical care through research and evidence-based practice.</w:t>
       </w:r>
     </w:p>
     <w:p>
@@ -312,7 +312,7 @@
         <w:rPr>
           <w:b/>
         </w:rPr>
-        <w:t xml:space="preserve">General Surgery Resident (PGY-4)</w:t>
+        <w:t xml:space="preserve">General Surgery Resident (PGY-5)</w:t>
       </w:r>
       <w:r>
         <w:t xml:space="preserve"> </w:t>
@@ -1991,16 +1991,19 @@
         <w:t xml:space="preserve">Morada AO</w:t>
       </w:r>
       <w:r>
-        <w:t xml:space="preserve">, Becker JL, Furey MJ, Summa CH, Richards KR, Bodde J, Jordan RM, Bannon JP, Falvo A. Building a Better Sub-Internship Evaluation: A Multi-Stakeholder Approach.</w:t>
-      </w:r>
-      <w:r>
-        <w:t xml:space="preserve"> </w:t>
-      </w:r>
-      <w:r>
-        <w:rPr>
-          <w:i/>
-        </w:rPr>
-        <w:t xml:space="preserve">Manuscript in preparation for submission to Global Surgical Education: Journal of the Association for Surgical Education.</w:t>
+        <w:t xml:space="preserve">, Becker JL, Furey MJ, Summa CH, Richards KR, Bodde J, Baray A, Gordon ML, Patel A, Jordan RM, Bannon JP, Falvo A. Feasibility and Implementation of a Multi-Source, Competency-Based Evaluation System for Surgical Sub-Internship Students: A Single-Institution Pilot.</w:t>
+      </w:r>
+      <w:r>
+        <w:t xml:space="preserve"> </w:t>
+      </w:r>
+      <w:r>
+        <w:rPr>
+          <w:i/>
+        </w:rPr>
+        <w:t xml:space="preserve">Global Surgical Education: Journal of the Association for Surgical Education</w:t>
+      </w:r>
+      <w:r>
+        <w:t xml:space="preserve">. Under review; revised manuscript submitted October 2026 after major revisions.</w:t>
       </w:r>
     </w:p>
     <w:p>
@@ -2383,11 +2386,120 @@
       <w:pPr>
         <w:pStyle w:val="Heading3"/>
       </w:pPr>
-      <w:bookmarkStart w:id="74" w:name="oral-presentations"/>
+      <w:bookmarkStart w:id="74" w:name="submitted-abstracts-decision-pending"/>
+      <w:r>
+        <w:t xml:space="preserve">Submitted Abstracts (Decision Pending)</w:t>
+      </w:r>
+      <w:bookmarkEnd w:id="74"/>
+    </w:p>
+    <w:p>
+      <w:pPr>
+        <w:numPr>
+          <w:ilvl w:val="0"/>
+          <w:numId w:val="1020"/>
+        </w:numPr>
+      </w:pPr>
+      <w:r>
+        <w:rPr>
+          <w:b/>
+        </w:rPr>
+        <w:t xml:space="preserve">Morada AO</w:t>
+      </w:r>
+      <w:r>
+        <w:t xml:space="preserve">, Becker JL, Furey MJ, Summa CH, Richards KR, Bodde J, Baray A, Gordon ML, Patel A, Jordan RM, Bannon JP, Falvo A. Feasibility and Implementation of a Multi-Source, Competency-Based Evaluation System for Surgical Sub-Internship Students: A Single-Institution Pilot Study.</w:t>
+      </w:r>
+      <w:r>
+        <w:t xml:space="preserve"> </w:t>
+      </w:r>
+      <w:r>
+        <w:rPr>
+          <w:i/>
+        </w:rPr>
+        <w:t xml:space="preserve">American College of Surgeons Pennsylvania Commonwealth Chapter 2026 Abstract Competition</w:t>
+      </w:r>
+      <w:r>
+        <w:t xml:space="preserve">. Submitted September 2026.</w:t>
+      </w:r>
+    </w:p>
+    <w:p>
+      <w:pPr>
+        <w:numPr>
+          <w:ilvl w:val="0"/>
+          <w:numId w:val="1020"/>
+        </w:numPr>
+      </w:pPr>
+      <w:r>
+        <w:t xml:space="preserve">Dickey EM,</w:t>
+      </w:r>
+      <w:r>
+        <w:t xml:space="preserve"> </w:t>
+      </w:r>
+      <w:r>
+        <w:rPr>
+          <w:b/>
+        </w:rPr>
+        <w:t xml:space="preserve">Morada AO</w:t>
+      </w:r>
+      <w:r>
+        <w:t xml:space="preserve">, Furey MJ, Blansfield J, Amini N. Robotic Pancreatoduodenectomy for an Unusual Pancreatic Neuroendocrine Tumor of the Uncinate Process with Ampullary and Duodenal Extension [video abstract].</w:t>
+      </w:r>
+      <w:r>
+        <w:t xml:space="preserve"> </w:t>
+      </w:r>
+      <w:r>
+        <w:rPr>
+          <w:i/>
+        </w:rPr>
+        <w:t xml:space="preserve">Americas Hepato-Pancreato-Biliary Association (AHPBA) 2027 Annual Meeting</w:t>
+      </w:r>
+      <w:r>
+        <w:t xml:space="preserve">. Submitted October 2026.</w:t>
+      </w:r>
+    </w:p>
+    <w:p>
+      <w:pPr>
+        <w:numPr>
+          <w:ilvl w:val="0"/>
+          <w:numId w:val="1020"/>
+        </w:numPr>
+      </w:pPr>
+      <w:r>
+        <w:t xml:space="preserve">Dickey EM,</w:t>
+      </w:r>
+      <w:r>
+        <w:t xml:space="preserve"> </w:t>
+      </w:r>
+      <w:r>
+        <w:rPr>
+          <w:b/>
+        </w:rPr>
+        <w:t xml:space="preserve">Morada AO</w:t>
+      </w:r>
+      <w:r>
+        <w:t xml:space="preserve">, Furey MJ, Blansfield J, Amini N. Robotic Adrenalectomy for a Rapidly Expanding High-Grade Malignant Epithelioid Adrenal Neoplasm Presenting as Spontaneous Adrenal Hemorrhage [video abstract].</w:t>
+      </w:r>
+      <w:r>
+        <w:t xml:space="preserve"> </w:t>
+      </w:r>
+      <w:r>
+        <w:rPr>
+          <w:i/>
+        </w:rPr>
+        <w:t xml:space="preserve">Society of Surgical Oncology (SSO) 2027 Annual Meeting</w:t>
+      </w:r>
+      <w:r>
+        <w:t xml:space="preserve">. Submitted October 2026.</w:t>
+      </w:r>
+    </w:p>
+    <w:p>
+      <w:pPr>
+        <w:pStyle w:val="Heading3"/>
+      </w:pPr>
+      <w:bookmarkStart w:id="75" w:name="oral-presentations"/>
       <w:r>
         <w:t xml:space="preserve">Oral Presentations</w:t>
       </w:r>
-      <w:bookmarkEnd w:id="74"/>
+      <w:bookmarkEnd w:id="75"/>
     </w:p>
     <w:p>
       <w:pPr>
@@ -2404,7 +2516,7 @@
       <w:pPr>
         <w:numPr>
           <w:ilvl w:val="0"/>
-          <w:numId w:val="1020"/>
+          <w:numId w:val="1021"/>
         </w:numPr>
       </w:pPr>
       <w:r>
@@ -2433,7 +2545,7 @@
       <w:pPr>
         <w:numPr>
           <w:ilvl w:val="0"/>
-          <w:numId w:val="1020"/>
+          <w:numId w:val="1021"/>
         </w:numPr>
       </w:pPr>
       <w:r>
@@ -2468,7 +2580,7 @@
       <w:pPr>
         <w:numPr>
           <w:ilvl w:val="0"/>
-          <w:numId w:val="1020"/>
+          <w:numId w:val="1021"/>
         </w:numPr>
       </w:pPr>
       <w:r>
@@ -2503,7 +2615,7 @@
       <w:pPr>
         <w:numPr>
           <w:ilvl w:val="0"/>
-          <w:numId w:val="1020"/>
+          <w:numId w:val="1021"/>
         </w:numPr>
       </w:pPr>
       <w:r>
@@ -2538,7 +2650,7 @@
       <w:pPr>
         <w:numPr>
           <w:ilvl w:val="0"/>
-          <w:numId w:val="1020"/>
+          <w:numId w:val="1021"/>
         </w:numPr>
       </w:pPr>
       <w:r>
@@ -2573,7 +2685,7 @@
       <w:pPr>
         <w:numPr>
           <w:ilvl w:val="0"/>
-          <w:numId w:val="1020"/>
+          <w:numId w:val="1021"/>
         </w:numPr>
       </w:pPr>
       <w:r>
@@ -2602,7 +2714,7 @@
       <w:pPr>
         <w:numPr>
           <w:ilvl w:val="0"/>
-          <w:numId w:val="1020"/>
+          <w:numId w:val="1021"/>
         </w:numPr>
       </w:pPr>
       <w:r>
@@ -2631,7 +2743,7 @@
       <w:pPr>
         <w:numPr>
           <w:ilvl w:val="0"/>
-          <w:numId w:val="1020"/>
+          <w:numId w:val="1021"/>
         </w:numPr>
       </w:pPr>
       <w:r>
@@ -2666,7 +2778,7 @@
       <w:pPr>
         <w:numPr>
           <w:ilvl w:val="0"/>
-          <w:numId w:val="1020"/>
+          <w:numId w:val="1021"/>
         </w:numPr>
       </w:pPr>
       <w:r>
@@ -2701,17 +2813,17 @@
       <w:pPr>
         <w:pStyle w:val="Heading3"/>
       </w:pPr>
-      <w:bookmarkStart w:id="75" w:name="poster-presentations"/>
+      <w:bookmarkStart w:id="76" w:name="poster-presentations"/>
       <w:r>
         <w:t xml:space="preserve">Poster Presentations</w:t>
       </w:r>
-      <w:bookmarkEnd w:id="75"/>
-    </w:p>
-    <w:p>
-      <w:pPr>
-        <w:numPr>
-          <w:ilvl w:val="0"/>
-          <w:numId w:val="1021"/>
+      <w:bookmarkEnd w:id="76"/>
+    </w:p>
+    <w:p>
+      <w:pPr>
+        <w:numPr>
+          <w:ilvl w:val="0"/>
+          <w:numId w:val="1022"/>
         </w:numPr>
       </w:pPr>
       <w:r>
@@ -2734,46 +2846,6 @@
       </w:r>
       <w:r>
         <w:t xml:space="preserve">, Singapore, May 2025.</w:t>
-      </w:r>
-      <w:r>
-        <w:t xml:space="preserve"> </w:t>
-      </w:r>
-      <w:hyperlink r:id="rId76">
-        <w:r>
-          <w:rPr>
-            <w:rStyle w:val="Hyperlink"/>
-          </w:rPr>
-          <w:t xml:space="preserve">🖼️ PDF</w:t>
-        </w:r>
-      </w:hyperlink>
-    </w:p>
-    <w:p>
-      <w:pPr>
-        <w:numPr>
-          <w:ilvl w:val="0"/>
-          <w:numId w:val="1021"/>
-        </w:numPr>
-      </w:pPr>
-      <w:r>
-        <w:rPr>
-          <w:b/>
-        </w:rPr>
-        <w:t xml:space="preserve">Morada AO</w:t>
-      </w:r>
-      <w:r>
-        <w:t xml:space="preserve">, Senapathi SH, Bashiri A, Chai S, Cagir B. A Systematic Review of Primary Ileostomy Site Malignancies.</w:t>
-      </w:r>
-      <w:r>
-        <w:t xml:space="preserve"> </w:t>
-      </w:r>
-      <w:r>
-        <w:rPr>
-          <w:i/>
-        </w:rPr>
-        <w:t xml:space="preserve">Society of American Gastrointestinal and Endoscopic Surgeons 2021 Meeting</w:t>
-      </w:r>
-      <w:r>
-        <w:t xml:space="preserve">, Las Vegas, NV, August 2021.</w:t>
       </w:r>
       <w:r>
         <w:t xml:space="preserve"> </w:t>
@@ -2791,7 +2863,47 @@
       <w:pPr>
         <w:numPr>
           <w:ilvl w:val="0"/>
-          <w:numId w:val="1021"/>
+          <w:numId w:val="1022"/>
+        </w:numPr>
+      </w:pPr>
+      <w:r>
+        <w:rPr>
+          <w:b/>
+        </w:rPr>
+        <w:t xml:space="preserve">Morada AO</w:t>
+      </w:r>
+      <w:r>
+        <w:t xml:space="preserve">, Senapathi SH, Bashiri A, Chai S, Cagir B. A Systematic Review of Primary Ileostomy Site Malignancies.</w:t>
+      </w:r>
+      <w:r>
+        <w:t xml:space="preserve"> </w:t>
+      </w:r>
+      <w:r>
+        <w:rPr>
+          <w:i/>
+        </w:rPr>
+        <w:t xml:space="preserve">Society of American Gastrointestinal and Endoscopic Surgeons 2021 Meeting</w:t>
+      </w:r>
+      <w:r>
+        <w:t xml:space="preserve">, Las Vegas, NV, August 2021.</w:t>
+      </w:r>
+      <w:r>
+        <w:t xml:space="preserve"> </w:t>
+      </w:r>
+      <w:hyperlink r:id="rId78">
+        <w:r>
+          <w:rPr>
+            <w:rStyle w:val="Hyperlink"/>
+          </w:rPr>
+          <w:t xml:space="preserve">🖼️ PDF</w:t>
+        </w:r>
+      </w:hyperlink>
+    </w:p>
+    <w:p>
+      <w:pPr>
+        <w:numPr>
+          <w:ilvl w:val="0"/>
+          <w:numId w:val="1022"/>
         </w:numPr>
       </w:pPr>
       <w:r>
@@ -2826,7 +2938,7 @@
       <w:pPr>
         <w:numPr>
           <w:ilvl w:val="0"/>
-          <w:numId w:val="1021"/>
+          <w:numId w:val="1022"/>
         </w:numPr>
       </w:pPr>
       <w:r>
@@ -2861,7 +2973,7 @@
       <w:pPr>
         <w:numPr>
           <w:ilvl w:val="0"/>
-          <w:numId w:val="1021"/>
+          <w:numId w:val="1022"/>
         </w:numPr>
       </w:pPr>
       <w:r>
@@ -2896,7 +3008,7 @@
       <w:pPr>
         <w:numPr>
           <w:ilvl w:val="0"/>
-          <w:numId w:val="1021"/>
+          <w:numId w:val="1022"/>
         </w:numPr>
       </w:pPr>
       <w:r>
@@ -2931,7 +3043,7 @@
       <w:pPr>
         <w:numPr>
           <w:ilvl w:val="0"/>
-          <w:numId w:val="1021"/>
+          <w:numId w:val="1022"/>
         </w:numPr>
       </w:pPr>
       <w:r>
@@ -2966,7 +3078,7 @@
       <w:pPr>
         <w:numPr>
           <w:ilvl w:val="0"/>
-          <w:numId w:val="1021"/>
+          <w:numId w:val="1022"/>
         </w:numPr>
       </w:pPr>
       <w:r>
@@ -3001,7 +3113,7 @@
       <w:pPr>
         <w:numPr>
           <w:ilvl w:val="0"/>
-          <w:numId w:val="1021"/>
+          <w:numId w:val="1022"/>
         </w:numPr>
       </w:pPr>
       <w:r>
@@ -3030,7 +3142,7 @@
       <w:pPr>
         <w:numPr>
           <w:ilvl w:val="0"/>
-          <w:numId w:val="1021"/>
+          <w:numId w:val="1022"/>
         </w:numPr>
       </w:pPr>
       <w:r>
@@ -3065,7 +3177,7 @@
       <w:pPr>
         <w:numPr>
           <w:ilvl w:val="0"/>
-          <w:numId w:val="1021"/>
+          <w:numId w:val="1022"/>
         </w:numPr>
       </w:pPr>
       <w:r>
@@ -3100,7 +3212,7 @@
       <w:pPr>
         <w:numPr>
           <w:ilvl w:val="0"/>
-          <w:numId w:val="1021"/>
+          <w:numId w:val="1022"/>
         </w:numPr>
       </w:pPr>
       <w:r>
@@ -3129,7 +3241,7 @@
       <w:pPr>
         <w:numPr>
           <w:ilvl w:val="0"/>
-          <w:numId w:val="1021"/>
+          <w:numId w:val="1022"/>
         </w:numPr>
       </w:pPr>
       <w:r>
@@ -3158,7 +3270,7 @@
       <w:pPr>
         <w:numPr>
           <w:ilvl w:val="0"/>
-          <w:numId w:val="1021"/>
+          <w:numId w:val="1022"/>
         </w:numPr>
       </w:pPr>
       <w:r>
@@ -3187,7 +3299,7 @@
       <w:pPr>
         <w:numPr>
           <w:ilvl w:val="0"/>
-          <w:numId w:val="1021"/>
+          <w:numId w:val="1022"/>
         </w:numPr>
       </w:pPr>
       <w:r>
@@ -3222,7 +3334,7 @@
       <w:pPr>
         <w:numPr>
           <w:ilvl w:val="0"/>
-          <w:numId w:val="1021"/>
+          <w:numId w:val="1022"/>
         </w:numPr>
       </w:pPr>
       <w:r>
@@ -3257,7 +3369,7 @@
       <w:pPr>
         <w:numPr>
           <w:ilvl w:val="0"/>
-          <w:numId w:val="1021"/>
+          <w:numId w:val="1022"/>
         </w:numPr>
       </w:pPr>
       <w:r>
@@ -3292,7 +3404,7 @@
       <w:pPr>
         <w:numPr>
           <w:ilvl w:val="0"/>
-          <w:numId w:val="1021"/>
+          <w:numId w:val="1022"/>
         </w:numPr>
       </w:pPr>
       <w:r>
@@ -3327,7 +3439,7 @@
       <w:pPr>
         <w:numPr>
           <w:ilvl w:val="0"/>
-          <w:numId w:val="1021"/>
+          <w:numId w:val="1022"/>
         </w:numPr>
       </w:pPr>
       <w:r>
@@ -3356,7 +3468,7 @@
       <w:pPr>
         <w:numPr>
           <w:ilvl w:val="0"/>
-          <w:numId w:val="1021"/>
+          <w:numId w:val="1022"/>
         </w:numPr>
       </w:pPr>
       <w:r>
@@ -3391,7 +3503,7 @@
       <w:pPr>
         <w:numPr>
           <w:ilvl w:val="0"/>
-          <w:numId w:val="1021"/>
+          <w:numId w:val="1022"/>
         </w:numPr>
       </w:pPr>
       <w:r>
@@ -3420,7 +3532,7 @@
       <w:pPr>
         <w:numPr>
           <w:ilvl w:val="0"/>
-          <w:numId w:val="1021"/>
+          <w:numId w:val="1022"/>
         </w:numPr>
       </w:pPr>
       <w:r>
@@ -3449,17 +3561,17 @@
       <w:pPr>
         <w:pStyle w:val="Heading2"/>
       </w:pPr>
-      <w:bookmarkStart w:id="78" w:name="honors-and-awards"/>
+      <w:bookmarkStart w:id="79" w:name="honors-and-awards"/>
       <w:r>
         <w:t xml:space="preserve">Honors and Awards</w:t>
       </w:r>
-      <w:bookmarkEnd w:id="78"/>
-    </w:p>
-    <w:p>
-      <w:pPr>
-        <w:numPr>
-          <w:ilvl w:val="0"/>
-          <w:numId w:val="1022"/>
+      <w:bookmarkEnd w:id="79"/>
+    </w:p>
+    <w:p>
+      <w:pPr>
+        <w:numPr>
+          <w:ilvl w:val="0"/>
+          <w:numId w:val="1023"/>
         </w:numPr>
         <w:pStyle w:val="Compact"/>
       </w:pPr>
@@ -3477,7 +3589,7 @@
       <w:pPr>
         <w:numPr>
           <w:ilvl w:val="0"/>
-          <w:numId w:val="1022"/>
+          <w:numId w:val="1023"/>
         </w:numPr>
         <w:pStyle w:val="Compact"/>
       </w:pPr>
@@ -3495,7 +3607,7 @@
       <w:pPr>
         <w:numPr>
           <w:ilvl w:val="0"/>
-          <w:numId w:val="1022"/>
+          <w:numId w:val="1023"/>
         </w:numPr>
         <w:pStyle w:val="Compact"/>
       </w:pPr>
@@ -3531,7 +3643,7 @@
       <w:pPr>
         <w:numPr>
           <w:ilvl w:val="0"/>
-          <w:numId w:val="1022"/>
+          <w:numId w:val="1023"/>
         </w:numPr>
         <w:pStyle w:val="Compact"/>
       </w:pPr>
@@ -3549,7 +3661,7 @@
       <w:pPr>
         <w:numPr>
           <w:ilvl w:val="0"/>
-          <w:numId w:val="1022"/>
+          <w:numId w:val="1023"/>
         </w:numPr>
         <w:pStyle w:val="Compact"/>
       </w:pPr>
@@ -3567,7 +3679,7 @@
       <w:pPr>
         <w:numPr>
           <w:ilvl w:val="0"/>
-          <w:numId w:val="1022"/>
+          <w:numId w:val="1023"/>
         </w:numPr>
         <w:pStyle w:val="Compact"/>
       </w:pPr>
@@ -3585,7 +3697,7 @@
       <w:pPr>
         <w:numPr>
           <w:ilvl w:val="0"/>
-          <w:numId w:val="1022"/>
+          <w:numId w:val="1023"/>
         </w:numPr>
         <w:pStyle w:val="Compact"/>
       </w:pPr>
@@ -3603,17 +3715,17 @@
       <w:pPr>
         <w:pStyle w:val="Heading2"/>
       </w:pPr>
-      <w:bookmarkStart w:id="79" w:name="leadership-and-service"/>
+      <w:bookmarkStart w:id="80" w:name="leadership-and-service"/>
       <w:r>
         <w:t xml:space="preserve">Leadership and Service</w:t>
       </w:r>
-      <w:bookmarkEnd w:id="79"/>
-    </w:p>
-    <w:p>
-      <w:pPr>
-        <w:numPr>
-          <w:ilvl w:val="0"/>
-          <w:numId w:val="1023"/>
+      <w:bookmarkEnd w:id="80"/>
+    </w:p>
+    <w:p>
+      <w:pPr>
+        <w:numPr>
+          <w:ilvl w:val="0"/>
+          <w:numId w:val="1024"/>
         </w:numPr>
         <w:pStyle w:val="Compact"/>
       </w:pPr>
@@ -3628,39 +3740,6 @@
       </w:r>
       <w:r>
         <w:t xml:space="preserve">| 2017 – 2019 Regional Education Academy for Careers in Health (REACH-HEI), Geisinger Commonwealth School of Medicine</w:t>
-      </w:r>
-    </w:p>
-    <w:p>
-      <w:pPr>
-        <w:numPr>
-          <w:ilvl w:val="1"/>
-          <w:numId w:val="1024"/>
-        </w:numPr>
-        <w:pStyle w:val="Compact"/>
-      </w:pPr>
-      <w:r>
-        <w:t xml:space="preserve">Provided academic enrichment and mentoring for low-income and first-generation college students in northeastern Pennsylvania</w:t>
-      </w:r>
-    </w:p>
-    <w:p>
-      <w:pPr>
-        <w:numPr>
-          <w:ilvl w:val="0"/>
-          <w:numId w:val="1023"/>
-        </w:numPr>
-        <w:pStyle w:val="Compact"/>
-      </w:pPr>
-      <w:r>
-        <w:rPr>
-          <w:b/>
-        </w:rPr>
-        <w:t xml:space="preserve">President</w:t>
-      </w:r>
-      <w:r>
-        <w:t xml:space="preserve"> </w:t>
-      </w:r>
-      <w:r>
-        <w:t xml:space="preserve">| 2017 – 2019 Asian Pacific American Medical Student Association (APAMSA), Geisinger Commonwealth School of Medicine</w:t>
       </w:r>
     </w:p>
     <w:p>
@@ -3672,28 +3751,28 @@
         <w:pStyle w:val="Compact"/>
       </w:pPr>
       <w:r>
-        <w:t xml:space="preserve">Led organizational leadership and community service initiatives for APAMSA chapter</w:t>
-      </w:r>
-    </w:p>
-    <w:p>
-      <w:pPr>
-        <w:numPr>
-          <w:ilvl w:val="0"/>
-          <w:numId w:val="1023"/>
-        </w:numPr>
-        <w:pStyle w:val="Compact"/>
-      </w:pPr>
-      <w:r>
-        <w:rPr>
-          <w:b/>
-        </w:rPr>
-        <w:t xml:space="preserve">Peer Mentor</w:t>
-      </w:r>
-      <w:r>
-        <w:t xml:space="preserve"> </w:t>
-      </w:r>
-      <w:r>
-        <w:t xml:space="preserve">| 2018 – 2019 MD Peer Mentorship Program, Geisinger Commonwealth School of Medicine</w:t>
+        <w:t xml:space="preserve">Provided academic enrichment and mentoring for low-income and first-generation college students in northeastern Pennsylvania</w:t>
+      </w:r>
+    </w:p>
+    <w:p>
+      <w:pPr>
+        <w:numPr>
+          <w:ilvl w:val="0"/>
+          <w:numId w:val="1024"/>
+        </w:numPr>
+        <w:pStyle w:val="Compact"/>
+      </w:pPr>
+      <w:r>
+        <w:rPr>
+          <w:b/>
+        </w:rPr>
+        <w:t xml:space="preserve">President</w:t>
+      </w:r>
+      <w:r>
+        <w:t xml:space="preserve"> </w:t>
+      </w:r>
+      <w:r>
+        <w:t xml:space="preserve">| 2017 – 2019 Asian Pacific American Medical Student Association (APAMSA), Geisinger Commonwealth School of Medicine</w:t>
       </w:r>
     </w:p>
     <w:p>
@@ -3705,28 +3784,28 @@
         <w:pStyle w:val="Compact"/>
       </w:pPr>
       <w:r>
-        <w:t xml:space="preserve">Mentored first- and second-year medical students during their transition to medical school</w:t>
-      </w:r>
-    </w:p>
-    <w:p>
-      <w:pPr>
-        <w:numPr>
-          <w:ilvl w:val="0"/>
-          <w:numId w:val="1023"/>
-        </w:numPr>
-        <w:pStyle w:val="Compact"/>
-      </w:pPr>
-      <w:r>
-        <w:rPr>
-          <w:b/>
-        </w:rPr>
-        <w:t xml:space="preserve">Team Abby Member</w:t>
-      </w:r>
-      <w:r>
-        <w:t xml:space="preserve"> </w:t>
-      </w:r>
-      <w:r>
-        <w:t xml:space="preserve">| 2019 Hacking Health Competition, Geisinger Steel Institute for Health Innovation</w:t>
+        <w:t xml:space="preserve">Led organizational leadership and community service initiatives for APAMSA chapter</w:t>
+      </w:r>
+    </w:p>
+    <w:p>
+      <w:pPr>
+        <w:numPr>
+          <w:ilvl w:val="0"/>
+          <w:numId w:val="1024"/>
+        </w:numPr>
+        <w:pStyle w:val="Compact"/>
+      </w:pPr>
+      <w:r>
+        <w:rPr>
+          <w:b/>
+        </w:rPr>
+        <w:t xml:space="preserve">Peer Mentor</w:t>
+      </w:r>
+      <w:r>
+        <w:t xml:space="preserve"> </w:t>
+      </w:r>
+      <w:r>
+        <w:t xml:space="preserve">| 2018 – 2019 MD Peer Mentorship Program, Geisinger Commonwealth School of Medicine</w:t>
       </w:r>
     </w:p>
     <w:p>
@@ -3738,37 +3817,28 @@
         <w:pStyle w:val="Compact"/>
       </w:pPr>
       <w:r>
-        <w:rPr>
-          <w:b/>
-        </w:rPr>
-        <w:t xml:space="preserve">$5,000 first place winner</w:t>
-      </w:r>
-      <w:r>
-        <w:t xml:space="preserve"> </w:t>
-      </w:r>
-      <w:r>
-        <w:t xml:space="preserve">for healthcare innovation project addressing provider burnout and operational efficiency</w:t>
-      </w:r>
-    </w:p>
-    <w:p>
-      <w:pPr>
-        <w:numPr>
-          <w:ilvl w:val="0"/>
-          <w:numId w:val="1023"/>
-        </w:numPr>
-        <w:pStyle w:val="Compact"/>
-      </w:pPr>
-      <w:r>
-        <w:rPr>
-          <w:b/>
-        </w:rPr>
-        <w:t xml:space="preserve">Clinical Skills Chair</w:t>
-      </w:r>
-      <w:r>
-        <w:t xml:space="preserve"> </w:t>
-      </w:r>
-      <w:r>
-        <w:t xml:space="preserve">| 2018 – 2019 Plastic Surgery Interest Group, Geisinger Commonwealth School of Medicine</w:t>
+        <w:t xml:space="preserve">Mentored first- and second-year medical students during their transition to medical school</w:t>
+      </w:r>
+    </w:p>
+    <w:p>
+      <w:pPr>
+        <w:numPr>
+          <w:ilvl w:val="0"/>
+          <w:numId w:val="1024"/>
+        </w:numPr>
+        <w:pStyle w:val="Compact"/>
+      </w:pPr>
+      <w:r>
+        <w:rPr>
+          <w:b/>
+        </w:rPr>
+        <w:t xml:space="preserve">Team Abby Member</w:t>
+      </w:r>
+      <w:r>
+        <w:t xml:space="preserve"> </w:t>
+      </w:r>
+      <w:r>
+        <w:t xml:space="preserve">| 2019 Hacking Health Competition, Geisinger Steel Institute for Health Innovation</w:t>
       </w:r>
     </w:p>
     <w:p>
@@ -3780,28 +3850,37 @@
         <w:pStyle w:val="Compact"/>
       </w:pPr>
       <w:r>
-        <w:t xml:space="preserve">Organized clinical skills workshops and coordinated with anatomy lab for realistic surgical simulation</w:t>
-      </w:r>
-    </w:p>
-    <w:p>
-      <w:pPr>
-        <w:numPr>
-          <w:ilvl w:val="0"/>
-          <w:numId w:val="1023"/>
-        </w:numPr>
-        <w:pStyle w:val="Compact"/>
-      </w:pPr>
-      <w:r>
-        <w:rPr>
-          <w:b/>
-        </w:rPr>
-        <w:t xml:space="preserve">Assistant Team Captain</w:t>
-      </w:r>
-      <w:r>
-        <w:t xml:space="preserve"> </w:t>
-      </w:r>
-      <w:r>
-        <w:t xml:space="preserve">| 2016 – 2017 Cedars-Sinai Whipplers, Pancreatic Cancer Action Network (PanCAN), Los Angeles, CA</w:t>
+        <w:rPr>
+          <w:b/>
+        </w:rPr>
+        <w:t xml:space="preserve">$5,000 first place winner</w:t>
+      </w:r>
+      <w:r>
+        <w:t xml:space="preserve"> </w:t>
+      </w:r>
+      <w:r>
+        <w:t xml:space="preserve">for healthcare innovation project addressing provider burnout and operational efficiency</w:t>
+      </w:r>
+    </w:p>
+    <w:p>
+      <w:pPr>
+        <w:numPr>
+          <w:ilvl w:val="0"/>
+          <w:numId w:val="1024"/>
+        </w:numPr>
+        <w:pStyle w:val="Compact"/>
+      </w:pPr>
+      <w:r>
+        <w:rPr>
+          <w:b/>
+        </w:rPr>
+        <w:t xml:space="preserve">Clinical Skills Chair</w:t>
+      </w:r>
+      <w:r>
+        <w:t xml:space="preserve"> </w:t>
+      </w:r>
+      <w:r>
+        <w:t xml:space="preserve">| 2018 – 2019 Plastic Surgery Interest Group, Geisinger Commonwealth School of Medicine</w:t>
       </w:r>
     </w:p>
     <w:p>
@@ -3813,70 +3892,28 @@
         <w:pStyle w:val="Compact"/>
       </w:pPr>
       <w:r>
-        <w:t xml:space="preserve">Led team to</w:t>
-      </w:r>
-      <w:r>
-        <w:t xml:space="preserve"> </w:t>
-      </w:r>
-      <w:r>
-        <w:rPr>
-          <w:b/>
-        </w:rPr>
-        <w:t xml:space="preserve">#1 fundraising position</w:t>
-      </w:r>
-      <w:r>
-        <w:t xml:space="preserve"> </w:t>
-      </w:r>
-      <w:r>
-        <w:t xml:space="preserve">with</w:t>
-      </w:r>
-      <w:r>
-        <w:t xml:space="preserve"> </w:t>
-      </w:r>
-      <w:r>
-        <w:rPr>
-          <w:b/>
-        </w:rPr>
-        <w:t xml:space="preserve">$200,000+ raised</w:t>
-      </w:r>
-      <w:r>
-        <w:t xml:space="preserve"> </w:t>
-      </w:r>
-      <w:r>
-        <w:t xml:space="preserve">over two years</w:t>
-      </w:r>
-    </w:p>
-    <w:p>
-      <w:pPr>
-        <w:numPr>
-          <w:ilvl w:val="1"/>
-          <w:numId w:val="1029"/>
-        </w:numPr>
-        <w:pStyle w:val="Compact"/>
-      </w:pPr>
-      <w:r>
-        <w:t xml:space="preserve">Recruited 150+ team members through outreach and marketing initiatives</w:t>
-      </w:r>
-    </w:p>
-    <w:p>
-      <w:pPr>
-        <w:numPr>
-          <w:ilvl w:val="0"/>
-          <w:numId w:val="1023"/>
-        </w:numPr>
-        <w:pStyle w:val="Compact"/>
-      </w:pPr>
-      <w:r>
-        <w:rPr>
-          <w:b/>
-        </w:rPr>
-        <w:t xml:space="preserve">Team KiPOW Member</w:t>
-      </w:r>
-      <w:r>
-        <w:t xml:space="preserve"> </w:t>
-      </w:r>
-      <w:r>
-        <w:t xml:space="preserve">| 2016 UC Irvine School of Medicine Pediatric Interest Group, Orange County, CA</w:t>
+        <w:t xml:space="preserve">Organized clinical skills workshops and coordinated with anatomy lab for realistic surgical simulation</w:t>
+      </w:r>
+    </w:p>
+    <w:p>
+      <w:pPr>
+        <w:numPr>
+          <w:ilvl w:val="0"/>
+          <w:numId w:val="1024"/>
+        </w:numPr>
+        <w:pStyle w:val="Compact"/>
+      </w:pPr>
+      <w:r>
+        <w:rPr>
+          <w:b/>
+        </w:rPr>
+        <w:t xml:space="preserve">Assistant Team Captain</w:t>
+      </w:r>
+      <w:r>
+        <w:t xml:space="preserve"> </w:t>
+      </w:r>
+      <w:r>
+        <w:t xml:space="preserve">| 2016 – 2017 Cedars-Sinai Whipplers, Pancreatic Cancer Action Network (PanCAN), Los Angeles, CA</w:t>
       </w:r>
     </w:p>
     <w:p>
@@ -3888,28 +3925,70 @@
         <w:pStyle w:val="Compact"/>
       </w:pPr>
       <w:r>
-        <w:t xml:space="preserve">Health educator teaching nutrition and exercise to elementary students through UCI/CHOC partnership</w:t>
-      </w:r>
-    </w:p>
-    <w:p>
-      <w:pPr>
-        <w:numPr>
-          <w:ilvl w:val="0"/>
-          <w:numId w:val="1023"/>
-        </w:numPr>
-        <w:pStyle w:val="Compact"/>
-      </w:pPr>
-      <w:r>
-        <w:rPr>
-          <w:b/>
-        </w:rPr>
-        <w:t xml:space="preserve">Clinical Volunteer</w:t>
-      </w:r>
-      <w:r>
-        <w:t xml:space="preserve"> </w:t>
-      </w:r>
-      <w:r>
-        <w:t xml:space="preserve">| 2013 – 2014 COPE Health Solutions, St. John’s/Pleasant Valley Medical Centers, Ventura County, CA</w:t>
+        <w:t xml:space="preserve">Led team to</w:t>
+      </w:r>
+      <w:r>
+        <w:t xml:space="preserve"> </w:t>
+      </w:r>
+      <w:r>
+        <w:rPr>
+          <w:b/>
+        </w:rPr>
+        <w:t xml:space="preserve">#1 fundraising position</w:t>
+      </w:r>
+      <w:r>
+        <w:t xml:space="preserve"> </w:t>
+      </w:r>
+      <w:r>
+        <w:t xml:space="preserve">with</w:t>
+      </w:r>
+      <w:r>
+        <w:t xml:space="preserve"> </w:t>
+      </w:r>
+      <w:r>
+        <w:rPr>
+          <w:b/>
+        </w:rPr>
+        <w:t xml:space="preserve">$200,000+ raised</w:t>
+      </w:r>
+      <w:r>
+        <w:t xml:space="preserve"> </w:t>
+      </w:r>
+      <w:r>
+        <w:t xml:space="preserve">over two years</w:t>
+      </w:r>
+    </w:p>
+    <w:p>
+      <w:pPr>
+        <w:numPr>
+          <w:ilvl w:val="1"/>
+          <w:numId w:val="1030"/>
+        </w:numPr>
+        <w:pStyle w:val="Compact"/>
+      </w:pPr>
+      <w:r>
+        <w:t xml:space="preserve">Recruited 150+ team members through outreach and marketing initiatives</w:t>
+      </w:r>
+    </w:p>
+    <w:p>
+      <w:pPr>
+        <w:numPr>
+          <w:ilvl w:val="0"/>
+          <w:numId w:val="1024"/>
+        </w:numPr>
+        <w:pStyle w:val="Compact"/>
+      </w:pPr>
+      <w:r>
+        <w:rPr>
+          <w:b/>
+        </w:rPr>
+        <w:t xml:space="preserve">Team KiPOW Member</w:t>
+      </w:r>
+      <w:r>
+        <w:t xml:space="preserve"> </w:t>
+      </w:r>
+      <w:r>
+        <w:t xml:space="preserve">| 2016 UC Irvine School of Medicine Pediatric Interest Group, Orange County, CA</w:t>
       </w:r>
     </w:p>
     <w:p>
@@ -3921,6 +4000,39 @@
         <w:pStyle w:val="Compact"/>
       </w:pPr>
       <w:r>
+        <w:t xml:space="preserve">Health educator teaching nutrition and exercise to elementary students through UCI/CHOC partnership</w:t>
+      </w:r>
+    </w:p>
+    <w:p>
+      <w:pPr>
+        <w:numPr>
+          <w:ilvl w:val="0"/>
+          <w:numId w:val="1024"/>
+        </w:numPr>
+        <w:pStyle w:val="Compact"/>
+      </w:pPr>
+      <w:r>
+        <w:rPr>
+          <w:b/>
+        </w:rPr>
+        <w:t xml:space="preserve">Clinical Volunteer</w:t>
+      </w:r>
+      <w:r>
+        <w:t xml:space="preserve"> </w:t>
+      </w:r>
+      <w:r>
+        <w:t xml:space="preserve">| 2013 – 2014 COPE Health Solutions, St. John’s/Pleasant Valley Medical Centers, Ventura County, CA</w:t>
+      </w:r>
+    </w:p>
+    <w:p>
+      <w:pPr>
+        <w:numPr>
+          <w:ilvl w:val="1"/>
+          <w:numId w:val="1032"/>
+        </w:numPr>
+        <w:pStyle w:val="Compact"/>
+      </w:pPr>
+      <w:r>
         <w:t xml:space="preserve">Rotational volunteer experience across multiple clinical departments including emergency medicine and surgery</w:t>
       </w:r>
     </w:p>
@@ -3928,17 +4040,17 @@
       <w:pPr>
         <w:pStyle w:val="Heading2"/>
       </w:pPr>
-      <w:bookmarkStart w:id="80" w:name="technical-skills-and-certifications"/>
+      <w:bookmarkStart w:id="81" w:name="technical-skills-and-certifications"/>
       <w:r>
         <w:t xml:space="preserve">Technical Skills and Certifications</w:t>
       </w:r>
-      <w:bookmarkEnd w:id="80"/>
-    </w:p>
-    <w:p>
-      <w:pPr>
-        <w:numPr>
-          <w:ilvl w:val="0"/>
-          <w:numId w:val="1032"/>
+      <w:bookmarkEnd w:id="81"/>
+    </w:p>
+    <w:p>
+      <w:pPr>
+        <w:numPr>
+          <w:ilvl w:val="0"/>
+          <w:numId w:val="1033"/>
         </w:numPr>
         <w:pStyle w:val="Compact"/>
       </w:pPr>
@@ -3947,57 +4059,6 @@
           <w:b/>
         </w:rPr>
         <w:t xml:space="preserve">Programming &amp; Data Analysis</w:t>
-      </w:r>
-    </w:p>
-    <w:p>
-      <w:pPr>
-        <w:numPr>
-          <w:ilvl w:val="1"/>
-          <w:numId w:val="1033"/>
-        </w:numPr>
-        <w:pStyle w:val="Compact"/>
-      </w:pPr>
-      <w:r>
-        <w:t xml:space="preserve">R Programming: Advanced statistical analysis of 92,297+ patient genomic datasets, clinical outcomes research</w:t>
-      </w:r>
-    </w:p>
-    <w:p>
-      <w:pPr>
-        <w:numPr>
-          <w:ilvl w:val="1"/>
-          <w:numId w:val="1033"/>
-        </w:numPr>
-        <w:pStyle w:val="Compact"/>
-      </w:pPr>
-      <w:r>
-        <w:t xml:space="preserve">Python: Data science applications, machine learning implementations</w:t>
-      </w:r>
-    </w:p>
-    <w:p>
-      <w:pPr>
-        <w:numPr>
-          <w:ilvl w:val="1"/>
-          <w:numId w:val="1033"/>
-        </w:numPr>
-        <w:pStyle w:val="Compact"/>
-      </w:pPr>
-      <w:r>
-        <w:t xml:space="preserve">SQL: Database querying and management for clinical research studies</w:t>
-      </w:r>
-    </w:p>
-    <w:p>
-      <w:pPr>
-        <w:numPr>
-          <w:ilvl w:val="0"/>
-          <w:numId w:val="1032"/>
-        </w:numPr>
-        <w:pStyle w:val="Compact"/>
-      </w:pPr>
-      <w:r>
-        <w:rPr>
-          <w:b/>
-        </w:rPr>
-        <w:t xml:space="preserve">Research Methodology</w:t>
       </w:r>
     </w:p>
     <w:p>
@@ -4009,7 +4070,7 @@
         <w:pStyle w:val="Compact"/>
       </w:pPr>
       <w:r>
-        <w:t xml:space="preserve">Large-scale data analysis: Genomic medicine applications, clinical outcomes research</w:t>
+        <w:t xml:space="preserve">R Programming: Advanced statistical analysis of 92,297+ patient genomic datasets, clinical outcomes research</w:t>
       </w:r>
     </w:p>
     <w:p>
@@ -4021,7 +4082,7 @@
         <w:pStyle w:val="Compact"/>
       </w:pPr>
       <w:r>
-        <w:t xml:space="preserve">Statistical modeling: High-volume hypothesis testing, biostatistics</w:t>
+        <w:t xml:space="preserve">Python: Data science applications, machine learning implementations</w:t>
       </w:r>
     </w:p>
     <w:p>
@@ -4033,34 +4094,22 @@
         <w:pStyle w:val="Compact"/>
       </w:pPr>
       <w:r>
-        <w:t xml:space="preserve">Biorepository management: Specimen coordination for translational research studies</w:t>
-      </w:r>
-    </w:p>
-    <w:p>
-      <w:pPr>
-        <w:numPr>
-          <w:ilvl w:val="1"/>
-          <w:numId w:val="1034"/>
-        </w:numPr>
-        <w:pStyle w:val="Compact"/>
-      </w:pPr>
-      <w:r>
-        <w:t xml:space="preserve">Literature synthesis: Systematic review methodology, evidence-based analysis</w:t>
-      </w:r>
-    </w:p>
-    <w:p>
-      <w:pPr>
-        <w:numPr>
-          <w:ilvl w:val="0"/>
-          <w:numId w:val="1032"/>
-        </w:numPr>
-        <w:pStyle w:val="Compact"/>
-      </w:pPr>
-      <w:r>
-        <w:rPr>
-          <w:b/>
-        </w:rPr>
-        <w:t xml:space="preserve">Machine Learning &amp; AI</w:t>
+        <w:t xml:space="preserve">SQL: Database querying and management for clinical research studies</w:t>
+      </w:r>
+    </w:p>
+    <w:p>
+      <w:pPr>
+        <w:numPr>
+          <w:ilvl w:val="0"/>
+          <w:numId w:val="1033"/>
+        </w:numPr>
+        <w:pStyle w:val="Compact"/>
+      </w:pPr>
+      <w:r>
+        <w:rPr>
+          <w:b/>
+        </w:rPr>
+        <w:t xml:space="preserve">Research Methodology</w:t>
       </w:r>
     </w:p>
     <w:p>
@@ -4072,7 +4121,7 @@
         <w:pStyle w:val="Compact"/>
       </w:pPr>
       <w:r>
-        <w:t xml:space="preserve">AI for Medicine - DeepLearning.AI (2020): Medical imaging, clinical prediction models</w:t>
+        <w:t xml:space="preserve">Large-scale data analysis: Genomic medicine applications, clinical outcomes research</w:t>
       </w:r>
     </w:p>
     <w:p>
@@ -4084,7 +4133,7 @@
         <w:pStyle w:val="Compact"/>
       </w:pPr>
       <w:r>
-        <w:t xml:space="preserve">Machine Learning - Stanford University (2017): Supervised/unsupervised learning algorithms</w:t>
+        <w:t xml:space="preserve">Statistical modeling: High-volume hypothesis testing, biostatistics</w:t>
       </w:r>
     </w:p>
     <w:p>
@@ -4096,22 +4145,34 @@
         <w:pStyle w:val="Compact"/>
       </w:pPr>
       <w:r>
-        <w:t xml:space="preserve">Data Science Specialization - Johns Hopkins University (2016): R programming, statistical inference</w:t>
-      </w:r>
-    </w:p>
-    <w:p>
-      <w:pPr>
-        <w:numPr>
-          <w:ilvl w:val="0"/>
-          <w:numId w:val="1032"/>
-        </w:numPr>
-        <w:pStyle w:val="Compact"/>
-      </w:pPr>
-      <w:r>
-        <w:rPr>
-          <w:b/>
-        </w:rPr>
-        <w:t xml:space="preserve">Clinical Certifications</w:t>
+        <w:t xml:space="preserve">Biorepository management: Specimen coordination for translational research studies</w:t>
+      </w:r>
+    </w:p>
+    <w:p>
+      <w:pPr>
+        <w:numPr>
+          <w:ilvl w:val="1"/>
+          <w:numId w:val="1035"/>
+        </w:numPr>
+        <w:pStyle w:val="Compact"/>
+      </w:pPr>
+      <w:r>
+        <w:t xml:space="preserve">Literature synthesis: Systematic review methodology, evidence-based analysis</w:t>
+      </w:r>
+    </w:p>
+    <w:p>
+      <w:pPr>
+        <w:numPr>
+          <w:ilvl w:val="0"/>
+          <w:numId w:val="1033"/>
+        </w:numPr>
+        <w:pStyle w:val="Compact"/>
+      </w:pPr>
+      <w:r>
+        <w:rPr>
+          <w:b/>
+        </w:rPr>
+        <w:t xml:space="preserve">Machine Learning &amp; AI</w:t>
       </w:r>
     </w:p>
     <w:p>
@@ -4123,7 +4184,7 @@
         <w:pStyle w:val="Compact"/>
       </w:pPr>
       <w:r>
-        <w:t xml:space="preserve">Bleeding Control Basic - American College of Surgeons (2017)</w:t>
+        <w:t xml:space="preserve">AI for Medicine - DeepLearning.AI (2020): Medical imaging, clinical prediction models</w:t>
       </w:r>
     </w:p>
     <w:p>
@@ -4135,6 +4196,57 @@
         <w:pStyle w:val="Compact"/>
       </w:pPr>
       <w:r>
+        <w:t xml:space="preserve">Machine Learning - Stanford University (2017): Supervised/unsupervised learning algorithms</w:t>
+      </w:r>
+    </w:p>
+    <w:p>
+      <w:pPr>
+        <w:numPr>
+          <w:ilvl w:val="1"/>
+          <w:numId w:val="1036"/>
+        </w:numPr>
+        <w:pStyle w:val="Compact"/>
+      </w:pPr>
+      <w:r>
+        <w:t xml:space="preserve">Data Science Specialization - Johns Hopkins University (2016): R programming, statistical inference</w:t>
+      </w:r>
+    </w:p>
+    <w:p>
+      <w:pPr>
+        <w:numPr>
+          <w:ilvl w:val="0"/>
+          <w:numId w:val="1033"/>
+        </w:numPr>
+        <w:pStyle w:val="Compact"/>
+      </w:pPr>
+      <w:r>
+        <w:rPr>
+          <w:b/>
+        </w:rPr>
+        <w:t xml:space="preserve">Clinical Certifications</w:t>
+      </w:r>
+    </w:p>
+    <w:p>
+      <w:pPr>
+        <w:numPr>
+          <w:ilvl w:val="1"/>
+          <w:numId w:val="1037"/>
+        </w:numPr>
+        <w:pStyle w:val="Compact"/>
+      </w:pPr>
+      <w:r>
+        <w:t xml:space="preserve">Bleeding Control Basic - American College of Surgeons (2017)</w:t>
+      </w:r>
+    </w:p>
+    <w:p>
+      <w:pPr>
+        <w:numPr>
+          <w:ilvl w:val="1"/>
+          <w:numId w:val="1037"/>
+        </w:numPr>
+        <w:pStyle w:val="Compact"/>
+      </w:pPr>
+      <w:r>
         <w:t xml:space="preserve">Emergency Medical Technician - California EMSA License E084811 (2011-2017)</w:t>
       </w:r>
     </w:p>
@@ -4142,17 +4254,17 @@
       <w:pPr>
         <w:pStyle w:val="Heading2"/>
       </w:pPr>
-      <w:bookmarkStart w:id="81" w:name="professional-memberships"/>
+      <w:bookmarkStart w:id="82" w:name="professional-memberships"/>
       <w:r>
         <w:t xml:space="preserve">Professional Memberships</w:t>
       </w:r>
-      <w:bookmarkEnd w:id="81"/>
-    </w:p>
-    <w:p>
-      <w:pPr>
-        <w:numPr>
-          <w:ilvl w:val="0"/>
-          <w:numId w:val="1037"/>
+      <w:bookmarkEnd w:id="82"/>
+    </w:p>
+    <w:p>
+      <w:pPr>
+        <w:numPr>
+          <w:ilvl w:val="0"/>
+          <w:numId w:val="1038"/>
         </w:numPr>
         <w:pStyle w:val="Compact"/>
       </w:pPr>
@@ -4167,7 +4279,7 @@
       <w:pPr>
         <w:numPr>
           <w:ilvl w:val="0"/>
-          <w:numId w:val="1037"/>
+          <w:numId w:val="1038"/>
         </w:numPr>
         <w:pStyle w:val="Compact"/>
       </w:pPr>
@@ -4182,7 +4294,7 @@
       <w:pPr>
         <w:numPr>
           <w:ilvl w:val="0"/>
-          <w:numId w:val="1037"/>
+          <w:numId w:val="1038"/>
         </w:numPr>
         <w:pStyle w:val="Compact"/>
       </w:pPr>
@@ -4194,7 +4306,7 @@
       <w:pPr>
         <w:numPr>
           <w:ilvl w:val="0"/>
-          <w:numId w:val="1037"/>
+          <w:numId w:val="1038"/>
         </w:numPr>
         <w:pStyle w:val="Compact"/>
       </w:pPr>
@@ -4206,7 +4318,7 @@
       <w:pPr>
         <w:numPr>
           <w:ilvl w:val="0"/>
-          <w:numId w:val="1037"/>
+          <w:numId w:val="1038"/>
         </w:numPr>
         <w:pStyle w:val="Compact"/>
       </w:pPr>
@@ -4218,11 +4330,11 @@
       <w:pPr>
         <w:pStyle w:val="Heading2"/>
       </w:pPr>
-      <w:bookmarkStart w:id="82" w:name="cultural-competencies"/>
+      <w:bookmarkStart w:id="83" w:name="cultural-competencies"/>
       <w:r>
         <w:t xml:space="preserve">Cultural Competencies</w:t>
       </w:r>
-      <w:bookmarkEnd w:id="82"/>
+      <w:bookmarkEnd w:id="83"/>
     </w:p>
     <w:p>
       <w:pPr>
@@ -4236,17 +4348,17 @@
       <w:pPr>
         <w:pStyle w:val="Heading2"/>
       </w:pPr>
-      <w:bookmarkStart w:id="83" w:name="personal-interests"/>
+      <w:bookmarkStart w:id="84" w:name="personal-interests"/>
       <w:r>
         <w:t xml:space="preserve">Personal Interests</w:t>
       </w:r>
-      <w:bookmarkEnd w:id="83"/>
-    </w:p>
-    <w:p>
-      <w:pPr>
-        <w:numPr>
-          <w:ilvl w:val="0"/>
-          <w:numId w:val="1038"/>
+      <w:bookmarkEnd w:id="84"/>
+    </w:p>
+    <w:p>
+      <w:pPr>
+        <w:numPr>
+          <w:ilvl w:val="0"/>
+          <w:numId w:val="1039"/>
         </w:numPr>
         <w:pStyle w:val="Compact"/>
       </w:pPr>
@@ -4777,7 +4889,34 @@
     </w:lvlOverride>
   </w:num>
   <w:num w:numId="1022">
-    <w:abstractNumId w:val="991"/>
+    <w:abstractNumId w:val="99411"/>
+    <w:lvlOverride w:ilvl="0">
+      <w:startOverride w:val="1"/>
+    </w:lvlOverride>
+    <w:lvlOverride w:ilvl="1">
+      <w:startOverride w:val="1"/>
+    </w:lvlOverride>
+    <w:lvlOverride w:ilvl="2">
+      <w:startOverride w:val="1"/>
+    </w:lvlOverride>
+    <w:lvlOverride w:ilvl="3">
+      <w:startOverride w:val="1"/>
+    </w:lvlOverride>
+    <w:lvlOverride w:ilvl="4">
+      <w:startOverride w:val="1"/>
+    </w:lvlOverride>
+    <w:lvlOverride w:ilvl="5">
+      <w:startOverride w:val="1"/>
+    </w:lvlOverride>
+    <w:lvlOverride w:ilvl="6">
+      <w:startOverride w:val="1"/>
+    </w:lvlOverride>
+    <w:lvlOverride w:ilvl="7">
+      <w:startOverride w:val="1"/>
+    </w:lvlOverride>
+    <w:lvlOverride w:ilvl="8">
+      <w:startOverride w:val="1"/>
+    </w:lvlOverride>
   </w:num>
   <w:num w:numId="1023">
     <w:abstractNumId w:val="991"/>
@@ -4825,6 +4964,9 @@
     <w:abstractNumId w:val="991"/>
   </w:num>
   <w:num w:numId="1038">
+    <w:abstractNumId w:val="991"/>
+  </w:num>
+  <w:num w:numId="1039">
     <w:abstractNumId w:val="991"/>
   </w:num>
 </w:numbering>

</xml_diff>